<commit_message>
docs(tests): record the October 21 evening run (707 tests) and the live to-close check in Spanish
</commit_message>
<xml_diff>
--- a/06_DOCUMENTACION_DE_PRUEBAS/ES/WORD/06_Documentacion_De_Pruebas.docx
+++ b/06_DOCUMENTACION_DE_PRUEBAS/ES/WORD/06_Documentacion_De_Pruebas.docx
@@ -268,7 +268,7 @@
               <w:pStyle w:val="Compact"/>
             </w:pPr>
             <w:r>
-              <w:t xml:space="preserve">20 de octubre de 2026</w:t>
+              <w:t xml:space="preserve">21 de octubre de 2026</w:t>
             </w:r>
           </w:p>
         </w:tc>
@@ -279,7 +279,7 @@
         <w:pStyle w:val="BodyText"/>
       </w:pPr>
       <w:r>
-        <w:t xml:space="preserve">Este documento reúne el plan de pruebas, el inventario de pruebas automatizadas que existen en los repositorios, sus resultados reales al ejecutarlas el 19 de octubre de 2026 (incluidas las pruebas de punta a punta, de rendimiento y de diseño adaptable contra el sistema completo) y los 42 casos de prueba funcionales, ejecutados el mismo día, trazados a los requisitos del SRS v7.6 (</w:t>
+        <w:t xml:space="preserve">Este documento reúne el plan de pruebas, el inventario de pruebas automatizadas que existen en los repositorios, sus resultados reales al ejecutarlas el 19 de octubre de 2026 (incluidas las pruebas de punta a punta, de rendimiento y de diseño adaptable contra el sistema completo) y otra vez el 21 de octubre, y los 42 casos de prueba funcionales, ejecutados el 19 de octubre, trazados a los requisitos del SRS v7.7 (</w:t>
       </w:r>
       <w:r>
         <w:rPr>
@@ -288,7 +288,7 @@
         <w:t xml:space="preserve">lavarapido-docs/01_INFORME_DE_ESPECIFICACION_DE_REQUISITOS</w:t>
       </w:r>
       <w:r>
-        <w:t xml:space="preserve">). El 20 de octubre de 2026 se ajustaron el inventario, el caso CP-42 y la matriz de trazabilidad porque el cambio de rol de una cuenta se revirtió en el código ese día, y la redacción de CP-10 porque el cliente cancela sin escribir motivo. La estructura sigue la norma ISO/IEC/IEEE 29119-3 de documentación de pruebas (International Organization for Standardization [ISO], 2021). Ningún resultado de este documento es supuesto.</w:t>
+        <w:t xml:space="preserve">). El 20 de octubre de 2026 se ajustaron el inventario, el caso CP-42 y la matriz de trazabilidad porque el cambio de rol de una cuenta se revirtió en el código ese día, y la redacción de CP-10 porque el cliente cancela sin escribir motivo. El 21 de octubre de 2026 se registraron dos ejecuciones de las pruebas automatizadas y de las 19 de punta a punta: la de la madrugada (689 pruebas, todas aprobadas) y la de la noche (707, todas aprobadas), que es la más reciente. Recogen los cambios de ese día: el token de una sesión cerrada deja de servir, la asignación de operarios usa un candado, el comprobante tiene un máximo de 2 MB y, para las reservas que terminaron y nadie cerró, el sistema solo cancela la programada que venció sin confirmarse y deja en "No asistió" la confirmada que nunca tuvo operario; la que tenía operario pasa a la lista "Por cerrar" del administrador. La estructura sigue la norma ISO/IEC/IEEE 29119-3 de documentación de pruebas (International Organization for Standardization [ISO], 2021). Ningún resultado de este documento es supuesto.</w:t>
       </w:r>
     </w:p>
     <w:bookmarkEnd w:id="20"/>
@@ -688,29 +688,29 @@
               <w:pStyle w:val="Compact"/>
             </w:pPr>
             <w:r>
-              <w:t xml:space="preserve">Integración de rutas del gateway</w:t>
-            </w:r>
-          </w:p>
-        </w:tc>
-        <w:tc>
-          <w:tcPr/>
-          <w:p>
-            <w:pPr>
-              <w:pStyle w:val="Compact"/>
-            </w:pPr>
-            <w:r>
-              <w:t xml:space="preserve">Que cada ruta pública llegue a su servicio</w:t>
-            </w:r>
-          </w:p>
-        </w:tc>
-        <w:tc>
-          <w:tcPr/>
-          <w:p>
-            <w:pPr>
-              <w:pStyle w:val="Compact"/>
-            </w:pPr>
-            <w:r>
-              <w:t xml:space="preserve">Spring Boot Test</w:t>
+              <w:t xml:space="preserve">Integración del gateway</w:t>
+            </w:r>
+          </w:p>
+        </w:tc>
+        <w:tc>
+          <w:tcPr/>
+          <w:p>
+            <w:pPr>
+              <w:pStyle w:val="Compact"/>
+            </w:pPr>
+            <w:r>
+              <w:t xml:space="preserve">Que cada ruta pública llegue a su servicio y que el token de una sesión cerrada no pase</w:t>
+            </w:r>
+          </w:p>
+        </w:tc>
+        <w:tc>
+          <w:tcPr/>
+          <w:p>
+            <w:pPr>
+              <w:pStyle w:val="Compact"/>
+            </w:pPr>
+            <w:r>
+              <w:t xml:space="preserve">Spring Boot Test; para la sesión, un security-service simulado con el servidor HTTP del JDK</w:t>
             </w:r>
           </w:p>
         </w:tc>
@@ -725,6 +725,18 @@
                 <w:rStyle w:val="VerbatimChar"/>
               </w:rPr>
               <w:t xml:space="preserve">GatewayRoutesTest.java</w:t>
+            </w:r>
+            <w:r>
+              <w:t xml:space="preserve">,</w:t>
+            </w:r>
+            <w:r>
+              <w:t xml:space="preserve"> </w:t>
+            </w:r>
+            <w:r>
+              <w:rPr>
+                <w:rStyle w:val="VerbatimChar"/>
+              </w:rPr>
+              <w:t xml:space="preserve">SessionCheckFilterTest.java</w:t>
             </w:r>
           </w:p>
         </w:tc>
@@ -1403,7 +1415,7 @@
         <w:pStyle w:val="FirstParagraph"/>
       </w:pPr>
       <w:r>
-        <w:t xml:space="preserve">Al 20 de octubre de 2026 los repositorios tienen 548 métodos de prueba: 505 en el backend y 43 en la web. La app móvil no tiene pruebas automatizadas; se revisa con la compilación de TypeScript y el recorrido de pantallas (sección 3.2).</w:t>
+        <w:t xml:space="preserve">Al 21 de octubre de 2026 (noche) los repositorios tienen 602 métodos de prueba: 540 en el backend y 62 en la web. La app móvil no tiene pruebas automatizadas; se revisa con la compilación de TypeScript y el recorrido de pantallas (sección 3.2).</w:t>
       </w:r>
     </w:p>
     <w:p>
@@ -1628,18 +1640,18 @@
               <w:pStyle w:val="Compact"/>
             </w:pPr>
             <w:r>
-              <w:t xml:space="preserve">1</w:t>
-            </w:r>
-          </w:p>
-        </w:tc>
-        <w:tc>
-          <w:tcPr/>
-          <w:p>
-            <w:pPr>
-              <w:pStyle w:val="Compact"/>
-            </w:pPr>
-            <w:r>
-              <w:t xml:space="preserve">8</w:t>
+              <w:t xml:space="preserve">2</w:t>
+            </w:r>
+          </w:p>
+        </w:tc>
+        <w:tc>
+          <w:tcPr/>
+          <w:p>
+            <w:pPr>
+              <w:pStyle w:val="Compact"/>
+            </w:pPr>
+            <w:r>
+              <w:t xml:space="preserve">14</w:t>
             </w:r>
           </w:p>
         </w:tc>
@@ -1687,6 +1699,15 @@
                 <w:rStyle w:val="VerbatimChar"/>
               </w:rPr>
               <w:t xml:space="preserve">GatewayRoutesTest</w:t>
+            </w:r>
+            <w:r>
+              <w:t xml:space="preserve">); chequeo de sesión: el token de una sesión cerrada no pasa, la respuesta se guarda por token, el logout la borra, si security-service falla la petición sigue y las rutas públicas no se revisan (</w:t>
+            </w:r>
+            <w:r>
+              <w:rPr>
+                <w:rStyle w:val="VerbatimChar"/>
+              </w:rPr>
+              <w:t xml:space="preserve">SessionCheckFilterTest</w:t>
             </w:r>
             <w:r>
               <w:t xml:space="preserve">)</w:t>
@@ -1724,18 +1745,18 @@
               <w:pStyle w:val="Compact"/>
             </w:pPr>
             <w:r>
-              <w:t xml:space="preserve">133</w:t>
-            </w:r>
-          </w:p>
-        </w:tc>
-        <w:tc>
-          <w:tcPr/>
-          <w:p>
-            <w:pPr>
-              <w:pStyle w:val="Compact"/>
-            </w:pPr>
-            <w:r>
-              <w:t xml:space="preserve">Registro, login con bloqueo por intentos fallidos, recuperación de contraseña, perfil y dirección, administración de usuarios (incluida la regla de que una cuenta de administrador no se desactiva), roles y permisos, preferencias, objetos valor, política de contraseñas, emisión de JWT y seguridad HTTP por rol (</w:t>
+              <w:t xml:space="preserve">139</w:t>
+            </w:r>
+          </w:p>
+        </w:tc>
+        <w:tc>
+          <w:tcPr/>
+          <w:p>
+            <w:pPr>
+              <w:pStyle w:val="Compact"/>
+            </w:pPr>
+            <w:r>
+              <w:t xml:space="preserve">Registro, login con bloqueo por intentos fallidos, recuperación de contraseña, perfil y dirección, administración de usuarios (incluida la regla de que una cuenta de administrador no se desactiva), roles y permisos, preferencias, objetos valor, política de contraseñas, emisión de JWT, sesiones abiertas y cerradas (el token de una sesión cerrada responde 401) y seguridad HTTP por rol (</w:t>
             </w:r>
             <w:r>
               <w:rPr>
@@ -1840,18 +1861,18 @@
               <w:pStyle w:val="Compact"/>
             </w:pPr>
             <w:r>
-              <w:t xml:space="preserve">43</w:t>
-            </w:r>
-          </w:p>
-        </w:tc>
-        <w:tc>
-          <w:tcPr/>
-          <w:p>
-            <w:pPr>
-              <w:pStyle w:val="Compact"/>
-            </w:pPr>
-            <w:r>
-              <w:t xml:space="preserve">Ciclo de vida de la reserva, disponibilidad y motivo de una hora no disponible, bahías (</w:t>
+              <w:t xml:space="preserve">50</w:t>
+            </w:r>
+          </w:p>
+        </w:tc>
+        <w:tc>
+          <w:tcPr/>
+          <w:p>
+            <w:pPr>
+              <w:pStyle w:val="Compact"/>
+            </w:pPr>
+            <w:r>
+              <w:t xml:space="preserve">Ciclo de vida de la reserva, cancelación de las programadas que vencieron sin confirmarse, "No asistió" solo para la confirmada vencida que pide operations por la ruta interna, disponibilidad y motivo de una hora no disponible, bahías (</w:t>
             </w:r>
             <w:r>
               <w:rPr>
@@ -1893,29 +1914,50 @@
               <w:pStyle w:val="Compact"/>
             </w:pPr>
             <w:r>
-              <w:t xml:space="preserve">11</w:t>
-            </w:r>
-          </w:p>
-        </w:tc>
-        <w:tc>
-          <w:tcPr/>
-          <w:p>
-            <w:pPr>
-              <w:pStyle w:val="Compact"/>
-            </w:pPr>
-            <w:r>
-              <w:t xml:space="preserve">55</w:t>
-            </w:r>
-          </w:p>
-        </w:tc>
-        <w:tc>
-          <w:tcPr/>
-          <w:p>
-            <w:pPr>
-              <w:pStyle w:val="Compact"/>
-            </w:pPr>
-            <w:r>
-              <w:t xml:space="preserve">Asignación manual y automática, operarios libres, ventana de inicio, ejecución, calificación, ausencias, métricas del operario, resumen del equipo, ficha del operario, informe de inspección y API web</w:t>
+              <w:t xml:space="preserve">13</w:t>
+            </w:r>
+          </w:p>
+        </w:tc>
+        <w:tc>
+          <w:tcPr/>
+          <w:p>
+            <w:pPr>
+              <w:pStyle w:val="Compact"/>
+            </w:pPr>
+            <w:r>
+              <w:t xml:space="preserve">67</w:t>
+            </w:r>
+          </w:p>
+        </w:tc>
+        <w:tc>
+          <w:tcPr/>
+          <w:p>
+            <w:pPr>
+              <w:pStyle w:val="Compact"/>
+            </w:pPr>
+            <w:r>
+              <w:t xml:space="preserve">Asignación manual y automática (con el candado de asignaciones), una sola regla para las reservas sin operario, reservas que terminaron y nadie cerró y lista "Por cerrar" (</w:t>
+            </w:r>
+            <w:r>
+              <w:rPr>
+                <w:rStyle w:val="VerbatimChar"/>
+              </w:rPr>
+              <w:t xml:space="preserve">FollowUpPolicyTest</w:t>
+            </w:r>
+            <w:r>
+              <w:t xml:space="preserve">,</w:t>
+            </w:r>
+            <w:r>
+              <w:t xml:space="preserve"> </w:t>
+            </w:r>
+            <w:r>
+              <w:rPr>
+                <w:rStyle w:val="VerbatimChar"/>
+              </w:rPr>
+              <w:t xml:space="preserve">FollowUpServiceTest</w:t>
+            </w:r>
+            <w:r>
+              <w:t xml:space="preserve">), operarios libres, ventana de inicio, ejecución, calificación, ausencias, métricas del operario, resumen del equipo, ficha del operario, informe de inspección y API web</w:t>
             </w:r>
           </w:p>
         </w:tc>
@@ -1939,29 +1981,53 @@
               <w:pStyle w:val="Compact"/>
             </w:pPr>
             <w:r>
-              <w:t xml:space="preserve">12</w:t>
-            </w:r>
-          </w:p>
-        </w:tc>
-        <w:tc>
-          <w:tcPr/>
-          <w:p>
-            <w:pPr>
-              <w:pStyle w:val="Compact"/>
-            </w:pPr>
-            <w:r>
-              <w:t xml:space="preserve">106</w:t>
-            </w:r>
-          </w:p>
-        </w:tc>
-        <w:tc>
-          <w:tcPr/>
-          <w:p>
-            <w:pPr>
-              <w:pStyle w:val="Compact"/>
-            </w:pPr>
-            <w:r>
-              <w:t xml:space="preserve">Casos de uso de notificaciones, fábrica de mensajes por evento, avisos en el idioma de la cuenta, recordatorios, alertas de reservas sin operario, aviso de versión nueva, tokens de dispositivo y controlador admin</w:t>
+              <w:t xml:space="preserve">13</w:t>
+            </w:r>
+          </w:p>
+        </w:tc>
+        <w:tc>
+          <w:tcPr/>
+          <w:p>
+            <w:pPr>
+              <w:pStyle w:val="Compact"/>
+            </w:pPr>
+            <w:r>
+              <w:t xml:space="preserve">108</w:t>
+            </w:r>
+          </w:p>
+        </w:tc>
+        <w:tc>
+          <w:tcPr/>
+          <w:p>
+            <w:pPr>
+              <w:pStyle w:val="Compact"/>
+            </w:pPr>
+            <w:r>
+              <w:t xml:space="preserve">Casos de uso de notificaciones, fábrica de mensajes por evento, avisos en el idioma de la cuenta, recordatorios, alertas de reservas sin operario, aviso de servicio sin registrar, campos</w:t>
+            </w:r>
+            <w:r>
+              <w:t xml:space="preserve"> </w:t>
+            </w:r>
+            <w:r>
+              <w:rPr>
+                <w:rStyle w:val="VerbatimChar"/>
+              </w:rPr>
+              <w:t xml:space="preserve">null</w:t>
+            </w:r>
+            <w:r>
+              <w:t xml:space="preserve"> </w:t>
+            </w:r>
+            <w:r>
+              <w:t xml:space="preserve">en el evento (</w:t>
+            </w:r>
+            <w:r>
+              <w:rPr>
+                <w:rStyle w:val="VerbatimChar"/>
+              </w:rPr>
+              <w:t xml:space="preserve">DomainEventEnvelopeTest</w:t>
+            </w:r>
+            <w:r>
+              <w:t xml:space="preserve">), aviso de versión nueva, tokens de dispositivo y controlador admin</w:t>
             </w:r>
           </w:p>
         </w:tc>
@@ -1996,18 +2062,18 @@
               <w:pStyle w:val="Compact"/>
             </w:pPr>
             <w:r>
-              <w:t xml:space="preserve">110</w:t>
-            </w:r>
-          </w:p>
-        </w:tc>
-        <w:tc>
-          <w:tcPr/>
-          <w:p>
-            <w:pPr>
-              <w:pStyle w:val="Compact"/>
-            </w:pPr>
-            <w:r>
-              <w:t xml:space="preserve">Pago y comprobante, referencia reutilizada, historial con filtros, promociones, puntos de fidelización, política de pagos, servicios de comandos y consultas, y 7 pruebas de persistencia contra SQL Server</w:t>
+              <w:t xml:space="preserve">112</w:t>
+            </w:r>
+          </w:p>
+        </w:tc>
+        <w:tc>
+          <w:tcPr/>
+          <w:p>
+            <w:pPr>
+              <w:pStyle w:val="Compact"/>
+            </w:pPr>
+            <w:r>
+              <w:t xml:space="preserve">Pago y comprobante (máximo 2 MB), referencia reutilizada, historial con filtros, promociones, puntos de fidelización, política de pagos, servicios de comandos y consultas, y 7 pruebas de persistencia contra SQL Server</w:t>
             </w:r>
           </w:p>
         </w:tc>
@@ -2031,18 +2097,18 @@
               <w:pStyle w:val="Compact"/>
             </w:pPr>
             <w:r>
-              <w:t xml:space="preserve">37</w:t>
-            </w:r>
-          </w:p>
-        </w:tc>
-        <w:tc>
-          <w:tcPr/>
-          <w:p>
-            <w:pPr>
-              <w:pStyle w:val="Compact"/>
-            </w:pPr>
-            <w:r>
-              <w:t xml:space="preserve">43</w:t>
+              <w:t xml:space="preserve">41</w:t>
+            </w:r>
+          </w:p>
+        </w:tc>
+        <w:tc>
+          <w:tcPr/>
+          <w:p>
+            <w:pPr>
+              <w:pStyle w:val="Compact"/>
+            </w:pPr>
+            <w:r>
+              <w:t xml:space="preserve">62</w:t>
             </w:r>
           </w:p>
         </w:tc>
@@ -2065,7 +2131,7 @@
               <w:t xml:space="preserve">should create</w:t>
             </w:r>
             <w:r>
-              <w:t xml:space="preserve">), mensajes de error de la API y selección de la cuenta de pago</w:t>
+              <w:t xml:space="preserve">), mensajes de error de la API, selección de la cuenta de pago, sesión entre pestañas, reservas sin operario y filtros, lista "Por cerrar", cuentas y roles fijos, reportes y barra de fidelización</w:t>
             </w:r>
           </w:p>
         </w:tc>
@@ -2209,7 +2275,7 @@
         <w:pStyle w:val="FirstParagraph"/>
       </w:pPr>
       <w:r>
-        <w:t xml:space="preserve">Las pruebas del backend son de dominio y de aplicación con dobles en memoria, más pruebas de controladores con MockMvc. La mayoría de las de la web comprueban que cada componente se crea;</w:t>
+        <w:t xml:space="preserve">Las pruebas del backend son de dominio y de aplicación con dobles en memoria, más pruebas de controladores con MockMvc. Muchas de las de la web solo comprueban que cada componente se crea;</w:t>
       </w:r>
       <w:r>
         <w:t xml:space="preserve"> </w:t>
@@ -2221,10 +2287,7 @@
         <w:t xml:space="preserve">api-error.spec.ts</w:t>
       </w:r>
       <w:r>
-        <w:t xml:space="preserve"> </w:t>
-      </w:r>
-      <w:r>
-        <w:t xml:space="preserve">y</w:t>
+        <w:t xml:space="preserve">,</w:t>
       </w:r>
       <w:r>
         <w:t xml:space="preserve"> </w:t>
@@ -2239,7 +2302,85 @@
         <w:t xml:space="preserve"> </w:t>
       </w:r>
       <w:r>
-        <w:t xml:space="preserve">prueban reglas reales (los mensajes de error de la API y la selección de la cuenta de pago).</w:t>
+        <w:t xml:space="preserve">y, desde el 21 de octubre de 2026,</w:t>
+      </w:r>
+      <w:r>
+        <w:t xml:space="preserve"> </w:t>
+      </w:r>
+      <w:r>
+        <w:rPr>
+          <w:rStyle w:val="VerbatimChar"/>
+        </w:rPr>
+        <w:t xml:space="preserve">auth.spec.ts</w:t>
+      </w:r>
+      <w:r>
+        <w:t xml:space="preserve">,</w:t>
+      </w:r>
+      <w:r>
+        <w:t xml:space="preserve"> </w:t>
+      </w:r>
+      <w:r>
+        <w:rPr>
+          <w:rStyle w:val="VerbatimChar"/>
+        </w:rPr>
+        <w:t xml:space="preserve">reservations-store.spec.ts</w:t>
+      </w:r>
+      <w:r>
+        <w:t xml:space="preserve">,</w:t>
+      </w:r>
+      <w:r>
+        <w:t xml:space="preserve"> </w:t>
+      </w:r>
+      <w:r>
+        <w:rPr>
+          <w:rStyle w:val="VerbatimChar"/>
+        </w:rPr>
+        <w:t xml:space="preserve">reservations.spec.ts</w:t>
+      </w:r>
+      <w:r>
+        <w:t xml:space="preserve">,</w:t>
+      </w:r>
+      <w:r>
+        <w:t xml:space="preserve"> </w:t>
+      </w:r>
+      <w:r>
+        <w:rPr>
+          <w:rStyle w:val="VerbatimChar"/>
+        </w:rPr>
+        <w:t xml:space="preserve">management.spec.ts</w:t>
+      </w:r>
+      <w:r>
+        <w:t xml:space="preserve">,</w:t>
+      </w:r>
+      <w:r>
+        <w:t xml:space="preserve"> </w:t>
+      </w:r>
+      <w:r>
+        <w:rPr>
+          <w:rStyle w:val="VerbatimChar"/>
+        </w:rPr>
+        <w:t xml:space="preserve">reports.spec.ts</w:t>
+      </w:r>
+      <w:r>
+        <w:t xml:space="preserve"> </w:t>
+      </w:r>
+      <w:r>
+        <w:t xml:space="preserve">y</w:t>
+      </w:r>
+      <w:r>
+        <w:t xml:space="preserve"> </w:t>
+      </w:r>
+      <w:r>
+        <w:rPr>
+          <w:rStyle w:val="VerbatimChar"/>
+        </w:rPr>
+        <w:t xml:space="preserve">dashboard.spec.ts</w:t>
+      </w:r>
+      <w:r>
+        <w:t xml:space="preserve"> </w:t>
+      </w:r>
+      <w:r>
+        <w:t xml:space="preserve">prueban reglas reales.</w:t>
       </w:r>
     </w:p>
     <w:bookmarkEnd w:id="26"/>
@@ -2257,7 +2398,7 @@
         <w:pStyle w:val="FirstParagraph"/>
       </w:pPr>
       <w:r>
-        <w:t xml:space="preserve">El 19 de octubre de 2026, con la rama</w:t>
+        <w:t xml:space="preserve">En la noche del 21 de octubre de 2026, con la rama</w:t>
       </w:r>
       <w:r>
         <w:t xml:space="preserve"> </w:t>
@@ -2273,7 +2414,7 @@
         <w:t xml:space="preserve"> </w:t>
       </w:r>
       <w:r>
-        <w:t xml:space="preserve">de los diez repositorios actualizada ese día, se ejecutaron las ocho suites automatizadas: 655 pruebas, todas aprobadas y ninguna omitida. Esta vez las 7 pruebas de persistencia de payment también corrieron, contra la base aislada</w:t>
+        <w:t xml:space="preserve">de los diez repositorios actualizada ese día, el equipo ejecutó otra vez las ocho suites automatizadas: 707 pruebas, todas aprobadas y ninguna omitida, incluidas las 7 de persistencia de payment contra la base aislada</w:t>
       </w:r>
       <w:r>
         <w:t xml:space="preserve"> </w:t>
@@ -2285,31 +2426,22 @@
         <w:t xml:space="preserve">LavaRapidoPaymentIT</w:t>
       </w:r>
       <w:r>
-        <w:t xml:space="preserve">. Al revertirse el cambio de rol el 20 de octubre salieron de security-service 2 pruebas (</w:t>
+        <w:t xml:space="preserve">. Es la ejecución final del día y recoge el cambio de las reservas que terminaron y nadie cerró, hecho después de la revisión del equipo, y el arreglo de los campos</w:t>
+      </w:r>
+      <w:r>
+        <w:t xml:space="preserve"> </w:t>
       </w:r>
       <w:r>
         <w:rPr>
           <w:rStyle w:val="VerbatimChar"/>
         </w:rPr>
-        <w:t xml:space="preserve">changingTheRoleReplacesItAndClosesTheSessions</w:t>
+        <w:t xml:space="preserve">null</w:t>
       </w:r>
       <w:r>
         <w:t xml:space="preserve"> </w:t>
       </w:r>
       <w:r>
-        <w:t xml:space="preserve">y</w:t>
-      </w:r>
-      <w:r>
-        <w:t xml:space="preserve"> </w:t>
-      </w:r>
-      <w:r>
-        <w:rPr>
-          <w:rStyle w:val="VerbatimChar"/>
-        </w:rPr>
-        <w:t xml:space="preserve">nobodyChangesTheirOwnRole</w:t>
-      </w:r>
-      <w:r>
-        <w:t xml:space="preserve">), así que hoy esa suite tiene 2 pruebas menos que las 151 de la Tabla 5; la Tabla 5 conserva los números reales de la ejecución del 19 de octubre.</w:t>
+        <w:t xml:space="preserve">en los eventos de notification-service. La Tabla 5 muestra cada suite y lo que cambió frente a la ejecución de la madrugada.</w:t>
       </w:r>
     </w:p>
     <w:p>
@@ -2333,7 +2465,7 @@
           <w:i/>
           <w:iCs/>
         </w:rPr>
-        <w:t xml:space="preserve">Resultados reales por artefacto (19 de octubre de 2026)</w:t>
+        <w:t xml:space="preserve">Resultados reales por artefacto (21 de octubre de 2026, ejecución de la noche)</w:t>
       </w:r>
     </w:p>
     <w:tbl>
@@ -2428,7 +2560,7 @@
               <w:pStyle w:val="Compact"/>
             </w:pPr>
             <w:r>
-              <w:t xml:space="preserve">Duración</w:t>
+              <w:t xml:space="preserve">Frente a la madrugada del 21 de octubre (689)</w:t>
             </w:r>
           </w:p>
         </w:tc>
@@ -2466,18 +2598,18 @@
               <w:pStyle w:val="Compact"/>
             </w:pPr>
             <w:r>
-              <w:t xml:space="preserve">43</w:t>
-            </w:r>
-          </w:p>
-        </w:tc>
-        <w:tc>
-          <w:tcPr/>
-          <w:p>
-            <w:pPr>
-              <w:pStyle w:val="Compact"/>
-            </w:pPr>
-            <w:r>
-              <w:t xml:space="preserve">43</w:t>
+              <w:t xml:space="preserve">62</w:t>
+            </w:r>
+          </w:p>
+        </w:tc>
+        <w:tc>
+          <w:tcPr/>
+          <w:p>
+            <w:pPr>
+              <w:pStyle w:val="Compact"/>
+            </w:pPr>
+            <w:r>
+              <w:t xml:space="preserve">62</w:t>
             </w:r>
           </w:p>
         </w:tc>
@@ -2510,7 +2642,16 @@
               <w:pStyle w:val="Compact"/>
             </w:pPr>
             <w:r>
-              <w:t xml:space="preserve">6,7 s</w:t>
+              <w:t xml:space="preserve">+2: lista "Por cerrar" en el store de reservas (</w:t>
+            </w:r>
+            <w:r>
+              <w:rPr>
+                <w:rStyle w:val="VerbatimChar"/>
+              </w:rPr>
+              <w:t xml:space="preserve">reservations-store.spec.ts</w:t>
+            </w:r>
+            <w:r>
+              <w:t xml:space="preserve">)</w:t>
             </w:r>
           </w:p>
         </w:tc>
@@ -2548,18 +2689,18 @@
               <w:pStyle w:val="Compact"/>
             </w:pPr>
             <w:r>
-              <w:t xml:space="preserve">34</w:t>
-            </w:r>
-          </w:p>
-        </w:tc>
-        <w:tc>
-          <w:tcPr/>
-          <w:p>
-            <w:pPr>
-              <w:pStyle w:val="Compact"/>
-            </w:pPr>
-            <w:r>
-              <w:t xml:space="preserve">34</w:t>
+              <w:t xml:space="preserve">40</w:t>
+            </w:r>
+          </w:p>
+        </w:tc>
+        <w:tc>
+          <w:tcPr/>
+          <w:p>
+            <w:pPr>
+              <w:pStyle w:val="Compact"/>
+            </w:pPr>
+            <w:r>
+              <w:t xml:space="preserve">40</w:t>
             </w:r>
           </w:p>
         </w:tc>
@@ -2592,7 +2733,7 @@
               <w:pStyle w:val="Compact"/>
             </w:pPr>
             <w:r>
-              <w:t xml:space="preserve">12,2 s</w:t>
+              <w:t xml:space="preserve">Sin cambios</w:t>
             </w:r>
           </w:p>
         </w:tc>
@@ -2630,18 +2771,18 @@
               <w:pStyle w:val="Compact"/>
             </w:pPr>
             <w:r>
-              <w:t xml:space="preserve">151</w:t>
-            </w:r>
-          </w:p>
-        </w:tc>
-        <w:tc>
-          <w:tcPr/>
-          <w:p>
-            <w:pPr>
-              <w:pStyle w:val="Compact"/>
-            </w:pPr>
-            <w:r>
-              <w:t xml:space="preserve">151</w:t>
+              <w:t xml:space="preserve">155</w:t>
+            </w:r>
+          </w:p>
+        </w:tc>
+        <w:tc>
+          <w:tcPr/>
+          <w:p>
+            <w:pPr>
+              <w:pStyle w:val="Compact"/>
+            </w:pPr>
+            <w:r>
+              <w:t xml:space="preserve">155</w:t>
             </w:r>
           </w:p>
         </w:tc>
@@ -2674,7 +2815,7 @@
               <w:pStyle w:val="Compact"/>
             </w:pPr>
             <w:r>
-              <w:t xml:space="preserve">9,7 s</w:t>
+              <w:t xml:space="preserve">Sin cambios</w:t>
             </w:r>
           </w:p>
         </w:tc>
@@ -2756,7 +2897,7 @@
               <w:pStyle w:val="Compact"/>
             </w:pPr>
             <w:r>
-              <w:t xml:space="preserve">7,4 s</w:t>
+              <w:t xml:space="preserve">Sin cambios</w:t>
             </w:r>
           </w:p>
         </w:tc>
@@ -2794,18 +2935,18 @@
               <w:pStyle w:val="Compact"/>
             </w:pPr>
             <w:r>
-              <w:t xml:space="preserve">43</w:t>
-            </w:r>
-          </w:p>
-        </w:tc>
-        <w:tc>
-          <w:tcPr/>
-          <w:p>
-            <w:pPr>
-              <w:pStyle w:val="Compact"/>
-            </w:pPr>
-            <w:r>
-              <w:t xml:space="preserve">43</w:t>
+              <w:t xml:space="preserve">50</w:t>
+            </w:r>
+          </w:p>
+        </w:tc>
+        <w:tc>
+          <w:tcPr/>
+          <w:p>
+            <w:pPr>
+              <w:pStyle w:val="Compact"/>
+            </w:pPr>
+            <w:r>
+              <w:t xml:space="preserve">50</w:t>
             </w:r>
           </w:p>
         </w:tc>
@@ -2838,7 +2979,40 @@
               <w:pStyle w:val="Compact"/>
             </w:pPr>
             <w:r>
-              <w:t xml:space="preserve">6,8 s</w:t>
+              <w:t xml:space="preserve">+3: solo la programada vence sola, y la confirmada pasa a No asistió únicamente cuando operations lo pide por la ruta interna y ya venció (</w:t>
+            </w:r>
+            <w:r>
+              <w:rPr>
+                <w:rStyle w:val="VerbatimChar"/>
+              </w:rPr>
+              <w:t xml:space="preserve">BookingTest</w:t>
+            </w:r>
+            <w:r>
+              <w:t xml:space="preserve">,</w:t>
+            </w:r>
+            <w:r>
+              <w:t xml:space="preserve"> </w:t>
+            </w:r>
+            <w:r>
+              <w:rPr>
+                <w:rStyle w:val="VerbatimChar"/>
+              </w:rPr>
+              <w:t xml:space="preserve">BookingServiceTest</w:t>
+            </w:r>
+            <w:r>
+              <w:t xml:space="preserve">,</w:t>
+            </w:r>
+            <w:r>
+              <w:t xml:space="preserve"> </w:t>
+            </w:r>
+            <w:r>
+              <w:rPr>
+                <w:rStyle w:val="VerbatimChar"/>
+              </w:rPr>
+              <w:t xml:space="preserve">BookingApiWebTest</w:t>
+            </w:r>
+            <w:r>
+              <w:t xml:space="preserve">)</w:t>
             </w:r>
           </w:p>
         </w:tc>
@@ -2876,18 +3050,18 @@
               <w:pStyle w:val="Compact"/>
             </w:pPr>
             <w:r>
-              <w:t xml:space="preserve">55</w:t>
-            </w:r>
-          </w:p>
-        </w:tc>
-        <w:tc>
-          <w:tcPr/>
-          <w:p>
-            <w:pPr>
-              <w:pStyle w:val="Compact"/>
-            </w:pPr>
-            <w:r>
-              <w:t xml:space="preserve">55</w:t>
+              <w:t xml:space="preserve">67</w:t>
+            </w:r>
+          </w:p>
+        </w:tc>
+        <w:tc>
+          <w:tcPr/>
+          <w:p>
+            <w:pPr>
+              <w:pStyle w:val="Compact"/>
+            </w:pPr>
+            <w:r>
+              <w:t xml:space="preserve">67</w:t>
             </w:r>
           </w:p>
         </w:tc>
@@ -2920,7 +3094,49 @@
               <w:pStyle w:val="Compact"/>
             </w:pPr>
             <w:r>
-              <w:t xml:space="preserve">7,6 s</w:t>
+              <w:t xml:space="preserve">+11: qué hacer con una reserva que terminó y nadie cerró (</w:t>
+            </w:r>
+            <w:r>
+              <w:rPr>
+                <w:rStyle w:val="VerbatimChar"/>
+              </w:rPr>
+              <w:t xml:space="preserve">FollowUpPolicyTest</w:t>
+            </w:r>
+            <w:r>
+              <w:t xml:space="preserve">), cierre de las que no tuvieron operario, aviso una sola vez, lista "Por cerrar" y cierre como "Se atendió" sin inventar horas (</w:t>
+            </w:r>
+            <w:r>
+              <w:rPr>
+                <w:rStyle w:val="VerbatimChar"/>
+              </w:rPr>
+              <w:t xml:space="preserve">FollowUpServiceTest</w:t>
+            </w:r>
+            <w:r>
+              <w:t xml:space="preserve">,</w:t>
+            </w:r>
+            <w:r>
+              <w:t xml:space="preserve"> </w:t>
+            </w:r>
+            <w:r>
+              <w:rPr>
+                <w:rStyle w:val="VerbatimChar"/>
+              </w:rPr>
+              <w:t xml:space="preserve">ServiceExecutionTest</w:t>
+            </w:r>
+            <w:r>
+              <w:t xml:space="preserve">,</w:t>
+            </w:r>
+            <w:r>
+              <w:t xml:space="preserve"> </w:t>
+            </w:r>
+            <w:r>
+              <w:rPr>
+                <w:rStyle w:val="VerbatimChar"/>
+              </w:rPr>
+              <w:t xml:space="preserve">OperationsApiWebTest</w:t>
+            </w:r>
+            <w:r>
+              <w:t xml:space="preserve">)</w:t>
             </w:r>
           </w:p>
         </w:tc>
@@ -2958,18 +3174,18 @@
               <w:pStyle w:val="Compact"/>
             </w:pPr>
             <w:r>
-              <w:t xml:space="preserve">112</w:t>
-            </w:r>
-          </w:p>
-        </w:tc>
-        <w:tc>
-          <w:tcPr/>
-          <w:p>
-            <w:pPr>
-              <w:pStyle w:val="Compact"/>
-            </w:pPr>
-            <w:r>
-              <w:t xml:space="preserve">112</w:t>
+              <w:t xml:space="preserve">114</w:t>
+            </w:r>
+          </w:p>
+        </w:tc>
+        <w:tc>
+          <w:tcPr/>
+          <w:p>
+            <w:pPr>
+              <w:pStyle w:val="Compact"/>
+            </w:pPr>
+            <w:r>
+              <w:t xml:space="preserve">114</w:t>
             </w:r>
           </w:p>
         </w:tc>
@@ -3002,7 +3218,40 @@
               <w:pStyle w:val="Compact"/>
             </w:pPr>
             <w:r>
-              <w:t xml:space="preserve">0,6 s</w:t>
+              <w:t xml:space="preserve">+2: aviso al operario y al administrador de un servicio sin registrar (</w:t>
+            </w:r>
+            <w:r>
+              <w:rPr>
+                <w:rStyle w:val="VerbatimChar"/>
+              </w:rPr>
+              <w:t xml:space="preserve">StaffNotificationsTest</w:t>
+            </w:r>
+            <w:r>
+              <w:t xml:space="preserve">) y campo</w:t>
+            </w:r>
+            <w:r>
+              <w:t xml:space="preserve"> </w:t>
+            </w:r>
+            <w:r>
+              <w:rPr>
+                <w:rStyle w:val="VerbatimChar"/>
+              </w:rPr>
+              <w:t xml:space="preserve">null</w:t>
+            </w:r>
+            <w:r>
+              <w:t xml:space="preserve"> </w:t>
+            </w:r>
+            <w:r>
+              <w:t xml:space="preserve">en el evento sin pasar a la cola de errores (</w:t>
+            </w:r>
+            <w:r>
+              <w:rPr>
+                <w:rStyle w:val="VerbatimChar"/>
+              </w:rPr>
+              <w:t xml:space="preserve">DomainEventEnvelopeTest</w:t>
+            </w:r>
+            <w:r>
+              <w:t xml:space="preserve">)</w:t>
             </w:r>
           </w:p>
         </w:tc>
@@ -3040,18 +3289,18 @@
               <w:pStyle w:val="Compact"/>
             </w:pPr>
             <w:r>
-              <w:t xml:space="preserve">113</w:t>
-            </w:r>
-          </w:p>
-        </w:tc>
-        <w:tc>
-          <w:tcPr/>
-          <w:p>
-            <w:pPr>
-              <w:pStyle w:val="Compact"/>
-            </w:pPr>
-            <w:r>
-              <w:t xml:space="preserve">113</w:t>
+              <w:t xml:space="preserve">115</w:t>
+            </w:r>
+          </w:p>
+        </w:tc>
+        <w:tc>
+          <w:tcPr/>
+          <w:p>
+            <w:pPr>
+              <w:pStyle w:val="Compact"/>
+            </w:pPr>
+            <w:r>
+              <w:t xml:space="preserve">115</w:t>
             </w:r>
           </w:p>
         </w:tc>
@@ -3084,7 +3333,7 @@
               <w:pStyle w:val="Compact"/>
             </w:pPr>
             <w:r>
-              <w:t xml:space="preserve">0,3 s</w:t>
+              <w:t xml:space="preserve">Sin cambios</w:t>
             </w:r>
           </w:p>
         </w:tc>
@@ -3163,7 +3412,7 @@
               <w:pStyle w:val="Compact"/>
             </w:pPr>
             <w:r>
-              <w:t xml:space="preserve">0,4 s</w:t>
+              <w:t xml:space="preserve">Sin cambios</w:t>
             </w:r>
           </w:p>
         </w:tc>
@@ -3254,7 +3503,7 @@
               <w:pStyle w:val="Compact"/>
             </w:pPr>
             <w:r>
-              <w:t xml:space="preserve">2 s</w:t>
+              <w:t xml:space="preserve">Sin cambios</w:t>
             </w:r>
           </w:p>
         </w:tc>
@@ -3294,7 +3543,7 @@
                 <w:b/>
                 <w:bCs/>
               </w:rPr>
-              <w:t xml:space="preserve">655</w:t>
+              <w:t xml:space="preserve">707</w:t>
             </w:r>
           </w:p>
         </w:tc>
@@ -3309,7 +3558,7 @@
                 <w:b/>
                 <w:bCs/>
               </w:rPr>
-              <w:t xml:space="preserve">655</w:t>
+              <w:t xml:space="preserve">707</w:t>
             </w:r>
           </w:p>
         </w:tc>
@@ -3349,6 +3598,13 @@
             <w:pPr>
               <w:pStyle w:val="Compact"/>
             </w:pPr>
+            <w:r>
+              <w:rPr>
+                <w:b/>
+                <w:bCs/>
+              </w:rPr>
+              <w:t xml:space="preserve">+18</w:t>
+            </w:r>
           </w:p>
         </w:tc>
       </w:tr>
@@ -3368,7 +3624,28 @@
         <w:t xml:space="preserve"> </w:t>
       </w:r>
       <w:r>
-        <w:t xml:space="preserve">Fuentes: salida de Vitest, resumen de</w:t>
+        <w:t xml:space="preserve">Fuentes: registro de las ejecuciones del equipo del 21 de octubre de 2026 (</w:t>
+      </w:r>
+      <w:r>
+        <w:rPr>
+          <w:rStyle w:val="VerbatimChar"/>
+        </w:rPr>
+        <w:t xml:space="preserve">vehicle-w-docs/11-quality/testing-strategy.md</w:t>
+      </w:r>
+      <w:r>
+        <w:t xml:space="preserve">), salida de Vitest y de</w:t>
+      </w:r>
+      <w:r>
+        <w:t xml:space="preserve"> </w:t>
+      </w:r>
+      <w:r>
+        <w:rPr>
+          <w:rStyle w:val="VerbatimChar"/>
+        </w:rPr>
+        <w:t xml:space="preserve">dotnet test</w:t>
+      </w:r>
+      <w:r>
+        <w:t xml:space="preserve">, y resumen de</w:t>
       </w:r>
       <w:r>
         <w:t xml:space="preserve"> </w:t>
@@ -3392,19 +3669,7 @@
         <w:t xml:space="preserve">Tests run:</w:t>
       </w:r>
       <w:r>
-        <w:t xml:space="preserve">) y reportes de surefire de cada servicio Java, y salida de</w:t>
-      </w:r>
-      <w:r>
-        <w:t xml:space="preserve"> </w:t>
-      </w:r>
-      <w:r>
-        <w:rPr>
-          <w:rStyle w:val="VerbatimChar"/>
-        </w:rPr>
-        <w:t xml:space="preserve">dotnet test</w:t>
-      </w:r>
-      <w:r>
-        <w:t xml:space="preserve">. Las duraciones de Maven suman el tiempo de las clases de prueba, sin contar la compilación. Hay más pruebas ejecutadas que métodos en la Tabla 4 porque las pruebas parametrizadas (</w:t>
+        <w:t xml:space="preserve">) con los reportes de surefire. Hay más pruebas ejecutadas que métodos en la Tabla 4 porque las pruebas parametrizadas (</w:t>
       </w:r>
       <w:r>
         <w:rPr>
@@ -3440,12 +3705,36 @@
         <w:t xml:space="preserve"> </w:t>
       </w:r>
       <w:r>
-        <w:t xml:space="preserve">del XML de surefire dice 68 por una clase de prueba anidada; Maven ejecuta y cuenta 69, y ese es el número correcto (en la versión anterior de este documento se había tomado 68).</w:t>
+        <w:t xml:space="preserve">del XML de surefire dice 68 por una clase de prueba anidada; Maven ejecuta y cuenta 69, y ese es el número correcto.</w:t>
       </w:r>
     </w:p>
     <w:p>
       <w:pPr>
         <w:pStyle w:val="FirstParagraph"/>
+      </w:pPr>
+      <w:r>
+        <w:t xml:space="preserve">La ejecución de la madrugada del 21 de octubre de 2026 tuvo 689 pruebas, todas aprobadas: web 60, api-gateway 40, security-service 155, customer-service 69, booking-service 47, operations-service 56, notification-service 112 y payment-service 150 (115 de dominio, 28 de aplicación y 7 de persistencia). Frente al 19 de octubre sumó 34: sesión entre pestañas, reservas sin operario y filtros, cuentas y roles fijos, reportes y barra de fidelización en la web (+17); chequeo de sesión en el gateway (+6); sesiones en security-service (+4, después de quitar 2 del cambio de rol revertido); reservas vencidas en booking-service (+4); candado de asignaciones en operations-service (+1); y comprobante de máximo 2 MB en payment-service (+2). Esa misma madrugada se repitieron por separado las suites que habían cambiado, con el mismo resultado.</w:t>
+      </w:r>
+    </w:p>
+    <w:p>
+      <w:pPr>
+        <w:pStyle w:val="BodyText"/>
+      </w:pPr>
+      <w:r>
+        <w:t xml:space="preserve">La ejecución del 19 de octubre de 2026 tuvo 655 pruebas, todas aprobadas: web 43, api-gateway 34, security-service 151, customer-service 69, booking-service 43, operations-service 55, notification-service 112 y payment-service 148 (113 de dominio, 28 de aplicación y 7 de persistencia). Las Figuras 1 a 3 son de esa ejecución.</w:t>
+      </w:r>
+    </w:p>
+    <w:p>
+      <w:pPr>
+        <w:pStyle w:val="BodyText"/>
+      </w:pPr>
+      <w:r>
+        <w:t xml:space="preserve">Además de las pruebas automatizadas, el 21 de octubre de 2026 se comprobó en vivo la lista "Por cerrar": una reserva sin operario pasó sola a No asistió; una con operario sin iniciar y una iniciada sin finalizar quedaron por cerrar, con un aviso al operario y otro al administrador que no se repitió; al cerrarlas como "Se atendió" quedaron completadas sin horas inventadas, y cerrarlas otra vez respondió 409. Se vio igual en la web y en la app móvil (390 px).</w:t>
+      </w:r>
+    </w:p>
+    <w:p>
+      <w:pPr>
+        <w:pStyle w:val="BodyText"/>
       </w:pPr>
       <w:r>
         <w:rPr>
@@ -3535,7 +3824,7 @@
           <w:i/>
           <w:iCs/>
         </w:rPr>
-        <w:t xml:space="preserve">Resultado de las pruebas de payment-service con las de persistencia</w:t>
+        <w:t xml:space="preserve">Resultado de las pruebas de payment-service con las de persistencia (19 de octubre de 2026)</w:t>
       </w:r>
     </w:p>
     <w:p>
@@ -3606,7 +3895,7 @@
           <w:i/>
           <w:iCs/>
         </w:rPr>
-        <w:t xml:space="preserve">Pruebas y compilación de producción de la web, y compilación de TypeScript de la app móvil</w:t>
+        <w:t xml:space="preserve">Pruebas y compilación de producción de la web, y compilación de TypeScript de la app móvil (19 de octubre de 2026)</w:t>
       </w:r>
     </w:p>
     <w:p>
@@ -3751,7 +4040,7 @@
         </w:numPr>
       </w:pPr>
       <w:r>
-        <w:t xml:space="preserve">La ejecución usó JDK 25 y .NET SDK 9 sobre proyectos para Java 21 y .NET 8. GitHub Actions corre las mismas pruebas con Temurin 21 y .NET 8 en cada cambio (Documento de Despliegue).</w:t>
+        <w:t xml:space="preserve">La ejecución del 19 de octubre usó JDK 25 y .NET SDK 9 sobre proyectos para Java 21 y .NET 8. GitHub Actions corre las mismas pruebas con Temurin 21 y .NET 8 en cada cambio (Documento de Despliegue).</w:t>
       </w:r>
     </w:p>
     <w:bookmarkStart w:id="39" w:name="Xce6a277aa17112c147f3c92b3125626eba1bc3a"/>
@@ -3810,7 +4099,7 @@
         <w:t xml:space="preserve"> </w:t>
       </w:r>
       <w:r>
-        <w:t xml:space="preserve">(el operario de prueba de la base local). Pasaron las 19 pruebas en 11,2 s. Cada prueba borra lo que crea y deja los puntos del cliente como estaban.</w:t>
+        <w:t xml:space="preserve">(el operario de prueba de la base local). Pasaron las 19 pruebas en 11,2 s. Cada prueba borra lo que crea y deja los puntos del cliente como estaban. El 21 de octubre de 2026 el equipo las ejecutó otra vez, en la madrugada y en la noche, ya con el chequeo de sesión del gateway activo, y en las dos pasaron las 19; los archivos de la Tabla 5a no cambiaron desde el 18 de octubre.</w:t>
       </w:r>
     </w:p>
     <w:p>
@@ -5216,7 +5505,7 @@
         <w:t xml:space="preserve">lavarapido-infra/e2e/booking-flow.test.js</w:t>
       </w:r>
       <w:r>
-        <w:t xml:space="preserve">.</w:t>
+        <w:t xml:space="preserve">. Los cambios del 21 de octubre de 2026 (el token de una sesión cerrada, el cierre de reservas vencidas y el comprobante de máximo 2 MB) todavía no tienen caso funcional propio; los cubren las pruebas automatizadas de la Tabla 5 (brecha 7 de la Tabla 8).</w:t>
       </w:r>
     </w:p>
     <w:p>
@@ -10119,7 +10408,7 @@
         <w:pStyle w:val="FirstParagraph"/>
       </w:pPr>
       <w:r>
-        <w:t xml:space="preserve">De los 41 requisitos del SRS v7.6, 38 tienen caso funcional y 39 una prueba automatizada relacionada; RF-032 y RF-034 solo tienen caso funcional, y RF-017, RF-023 y RF-025 solo prueba automatizada.</w:t>
+        <w:t xml:space="preserve">De los 41 requisitos del SRS v7.7, 38 tienen caso funcional y 39 una prueba automatizada relacionada; RF-032 y RF-034 solo tienen caso funcional, y RF-017, RF-023 y RF-025 solo prueba automatizada.</w:t>
       </w:r>
     </w:p>
     <w:p>
@@ -10849,6 +11138,24 @@
               </w:rPr>
               <w:t xml:space="preserve">POST /users/me/deactivate</w:t>
             </w:r>
+            <w:r>
+              <w:t xml:space="preserve">,</w:t>
+            </w:r>
+            <w:r>
+              <w:t xml:space="preserve"> </w:t>
+            </w:r>
+            <w:r>
+              <w:rPr>
+                <w:rStyle w:val="VerbatimChar"/>
+              </w:rPr>
+              <w:t xml:space="preserve">GET /auth/session</w:t>
+            </w:r>
+            <w:r>
+              <w:t xml:space="preserve"> </w:t>
+            </w:r>
+            <w:r>
+              <w:t xml:space="preserve">(gateway)</w:t>
+            </w:r>
           </w:p>
         </w:tc>
         <w:tc>
@@ -10911,6 +11218,54 @@
                 <w:rStyle w:val="VerbatimChar"/>
               </w:rPr>
               <w:t xml:space="preserve">AuthenticationServiceTest</w:t>
+            </w:r>
+            <w:r>
+              <w:t xml:space="preserve">,</w:t>
+            </w:r>
+            <w:r>
+              <w:t xml:space="preserve"> </w:t>
+            </w:r>
+            <w:r>
+              <w:rPr>
+                <w:rStyle w:val="VerbatimChar"/>
+              </w:rPr>
+              <w:t xml:space="preserve">ApiSecurityWebTest</w:t>
+            </w:r>
+            <w:r>
+              <w:t xml:space="preserve"> </w:t>
+            </w:r>
+            <w:r>
+              <w:t xml:space="preserve">y</w:t>
+            </w:r>
+            <w:r>
+              <w:t xml:space="preserve"> </w:t>
+            </w:r>
+            <w:r>
+              <w:rPr>
+                <w:rStyle w:val="VerbatimChar"/>
+              </w:rPr>
+              <w:t xml:space="preserve">SessionCheckFilterTest</w:t>
+            </w:r>
+            <w:r>
+              <w:t xml:space="preserve"> </w:t>
+            </w:r>
+            <w:r>
+              <w:t xml:space="preserve">(token de una sesión cerrada),</w:t>
+            </w:r>
+            <w:r>
+              <w:t xml:space="preserve"> </w:t>
+            </w:r>
+            <w:r>
+              <w:rPr>
+                <w:rStyle w:val="VerbatimChar"/>
+              </w:rPr>
+              <w:t xml:space="preserve">auth.spec.ts</w:t>
+            </w:r>
+            <w:r>
+              <w:t xml:space="preserve"> </w:t>
+            </w:r>
+            <w:r>
+              <w:t xml:space="preserve">(pestañas)</w:t>
             </w:r>
           </w:p>
         </w:tc>
@@ -11114,6 +11469,24 @@
               </w:rPr>
               <w:t xml:space="preserve">RolePermissionAdministrationServiceTest</w:t>
             </w:r>
+            <w:r>
+              <w:t xml:space="preserve">,</w:t>
+            </w:r>
+            <w:r>
+              <w:t xml:space="preserve"> </w:t>
+            </w:r>
+            <w:r>
+              <w:rPr>
+                <w:rStyle w:val="VerbatimChar"/>
+              </w:rPr>
+              <w:t xml:space="preserve">management.spec.ts</w:t>
+            </w:r>
+            <w:r>
+              <w:t xml:space="preserve"> </w:t>
+            </w:r>
+            <w:r>
+              <w:t xml:space="preserve">(roles fijos)</w:t>
+            </w:r>
           </w:p>
         </w:tc>
       </w:tr>
@@ -11921,6 +12294,30 @@
               </w:rPr>
               <w:t xml:space="preserve">PATCH /admin/bookings/{id}/status</w:t>
             </w:r>
+            <w:r>
+              <w:t xml:space="preserve">,</w:t>
+            </w:r>
+            <w:r>
+              <w:t xml:space="preserve"> </w:t>
+            </w:r>
+            <w:r>
+              <w:rPr>
+                <w:rStyle w:val="VerbatimChar"/>
+              </w:rPr>
+              <w:t xml:space="preserve">GET /admin/assignments/to-close</w:t>
+            </w:r>
+            <w:r>
+              <w:t xml:space="preserve">,</w:t>
+            </w:r>
+            <w:r>
+              <w:t xml:space="preserve"> </w:t>
+            </w:r>
+            <w:r>
+              <w:rPr>
+                <w:rStyle w:val="VerbatimChar"/>
+              </w:rPr>
+              <w:t xml:space="preserve">POST /admin/assignments/{bookingId}/attended</w:t>
+            </w:r>
           </w:p>
         </w:tc>
         <w:tc>
@@ -11935,6 +12332,24 @@
               </w:rPr>
               <w:t xml:space="preserve">/admin/reservations</w:t>
             </w:r>
+            <w:r>
+              <w:t xml:space="preserve">,</w:t>
+            </w:r>
+            <w:r>
+              <w:t xml:space="preserve"> </w:t>
+            </w:r>
+            <w:r>
+              <w:rPr>
+                <w:rStyle w:val="VerbatimChar"/>
+              </w:rPr>
+              <w:t xml:space="preserve">/admin</w:t>
+            </w:r>
+            <w:r>
+              <w:t xml:space="preserve"> </w:t>
+            </w:r>
+            <w:r>
+              <w:t xml:space="preserve">("Por cerrar")</w:t>
+            </w:r>
           </w:p>
         </w:tc>
         <w:tc>
@@ -11971,6 +12386,57 @@
                 <w:rStyle w:val="VerbatimChar"/>
               </w:rPr>
               <w:t xml:space="preserve">BookingServiceTest</w:t>
+            </w:r>
+            <w:r>
+              <w:t xml:space="preserve"> </w:t>
+            </w:r>
+            <w:r>
+              <w:t xml:space="preserve">(incluidas la cancelación de las programadas vencidas y la ruta interna de no asistió),</w:t>
+            </w:r>
+            <w:r>
+              <w:t xml:space="preserve"> </w:t>
+            </w:r>
+            <w:r>
+              <w:rPr>
+                <w:rStyle w:val="VerbatimChar"/>
+              </w:rPr>
+              <w:t xml:space="preserve">BookingApiWebTest</w:t>
+            </w:r>
+            <w:r>
+              <w:t xml:space="preserve">,</w:t>
+            </w:r>
+            <w:r>
+              <w:t xml:space="preserve"> </w:t>
+            </w:r>
+            <w:r>
+              <w:rPr>
+                <w:rStyle w:val="VerbatimChar"/>
+              </w:rPr>
+              <w:t xml:space="preserve">FollowUpPolicyTest</w:t>
+            </w:r>
+            <w:r>
+              <w:t xml:space="preserve">,</w:t>
+            </w:r>
+            <w:r>
+              <w:t xml:space="preserve"> </w:t>
+            </w:r>
+            <w:r>
+              <w:rPr>
+                <w:rStyle w:val="VerbatimChar"/>
+              </w:rPr>
+              <w:t xml:space="preserve">FollowUpServiceTest</w:t>
+            </w:r>
+            <w:r>
+              <w:t xml:space="preserve">,</w:t>
+            </w:r>
+            <w:r>
+              <w:t xml:space="preserve"> </w:t>
+            </w:r>
+            <w:r>
+              <w:rPr>
+                <w:rStyle w:val="VerbatimChar"/>
+              </w:rPr>
+              <w:t xml:space="preserve">reservations-store.spec.ts</w:t>
             </w:r>
           </w:p>
         </w:tc>
@@ -12195,6 +12661,21 @@
               </w:rPr>
               <w:t xml:space="preserve">OperationsServiceTest</w:t>
             </w:r>
+            <w:r>
+              <w:t xml:space="preserve"> </w:t>
+            </w:r>
+            <w:r>
+              <w:t xml:space="preserve">(candado de asignaciones y regla de reservas sin operario),</w:t>
+            </w:r>
+            <w:r>
+              <w:t xml:space="preserve"> </w:t>
+            </w:r>
+            <w:r>
+              <w:rPr>
+                <w:rStyle w:val="VerbatimChar"/>
+              </w:rPr>
+              <w:t xml:space="preserve">reservations-store.spec.ts</w:t>
+            </w:r>
           </w:p>
         </w:tc>
       </w:tr>
@@ -13137,7 +13618,10 @@
               <w:t xml:space="preserve">PaymentTests</w:t>
             </w:r>
             <w:r>
-              <w:t xml:space="preserve">,</w:t>
+              <w:t xml:space="preserve"> </w:t>
+            </w:r>
+            <w:r>
+              <w:t xml:space="preserve">(comprobante de máximo 2 MB),</w:t>
             </w:r>
             <w:r>
               <w:t xml:space="preserve"> </w:t>
@@ -14074,6 +14558,24 @@
                 <w:rStyle w:val="VerbatimChar"/>
               </w:rPr>
               <w:t xml:space="preserve">TeamSummaryCalculatorTest</w:t>
+            </w:r>
+            <w:r>
+              <w:t xml:space="preserve">,</w:t>
+            </w:r>
+            <w:r>
+              <w:t xml:space="preserve"> </w:t>
+            </w:r>
+            <w:r>
+              <w:rPr>
+                <w:rStyle w:val="VerbatimChar"/>
+              </w:rPr>
+              <w:t xml:space="preserve">reports.spec.ts</w:t>
+            </w:r>
+            <w:r>
+              <w:t xml:space="preserve"> </w:t>
+            </w:r>
+            <w:r>
+              <w:t xml:space="preserve">(solo cuentan las reservas completadas)</w:t>
             </w:r>
           </w:p>
         </w:tc>
@@ -14528,7 +15030,7 @@
               <w:pStyle w:val="Compact"/>
             </w:pPr>
             <w:r>
-              <w:t xml:space="preserve">La mayoría de las 43 pruebas de la web solo verifican que el componente se crea</w:t>
+              <w:t xml:space="preserve">Muchas de las 62 pruebas de la web solo verifican que el componente se crea; las 19 agregadas el 21 de octubre de 2026 ya prueban reglas reales (sesión entre pestañas, reservas sin operario, "Por cerrar", roles fijos y reportes)</w:t>
             </w:r>
           </w:p>
         </w:tc>
@@ -14593,7 +15095,7 @@
               <w:pStyle w:val="Compact"/>
             </w:pPr>
             <w:r>
-              <w:t xml:space="preserve">Las 7 pruebas de persistencia de payment necesitan una base migrada y se omiten sin ella; el 19 de octubre se corrieron contra</w:t>
+              <w:t xml:space="preserve">Las 7 pruebas de persistencia de payment necesitan una base migrada y se omiten sin ella; el 19 y el 21 de octubre se corrieron contra</w:t>
             </w:r>
             <w:r>
               <w:t xml:space="preserve"> </w:t>
@@ -14655,7 +15157,16 @@
               <w:pStyle w:val="Compact"/>
             </w:pPr>
             <w:r>
-              <w:t xml:space="preserve">De RF-023 (reportes) solo se prueban las métricas del operario y el resumen del equipo; la exportación PDF/Excel no tiene prueba</w:t>
+              <w:t xml:space="preserve">De RF-023 (reportes) se prueban las métricas del operario, el resumen del equipo y, desde el 21 de octubre de 2026, que solo cuenten las reservas completadas (</w:t>
+            </w:r>
+            <w:r>
+              <w:rPr>
+                <w:rStyle w:val="VerbatimChar"/>
+              </w:rPr>
+              <w:t xml:space="preserve">reports.spec.ts</w:t>
+            </w:r>
+            <w:r>
+              <w:t xml:space="preserve">); la exportación PDF/Excel no tiene prueba</w:t>
             </w:r>
           </w:p>
         </w:tc>
@@ -14767,6 +15278,56 @@
             </w:pPr>
             <w:r>
               <w:t xml:space="preserve">Cerrada el 19 de octubre de 2026 con los casos CP-34 a CP-41</w:t>
+            </w:r>
+          </w:p>
+        </w:tc>
+      </w:tr>
+      <w:tr>
+        <w:tc>
+          <w:tcPr/>
+          <w:p>
+            <w:pPr>
+              <w:pStyle w:val="Compact"/>
+            </w:pPr>
+            <w:r>
+              <w:t xml:space="preserve">7</w:t>
+            </w:r>
+          </w:p>
+        </w:tc>
+        <w:tc>
+          <w:tcPr/>
+          <w:p>
+            <w:pPr>
+              <w:pStyle w:val="Compact"/>
+            </w:pPr>
+            <w:r>
+              <w:t xml:space="preserve">Los cambios del 21 de octubre de 2026 (el token de una sesión cerrada deja de servir, las reservas que terminaron y nadie cerró con la lista "Por cerrar", el comprobante de más de 2 MB y el efectivo que solo aparece con su cuenta activa) no tienen caso funcional propio; los cubren pruebas automatizadas, salvo el efectivo, las 19 de punta a punta se ejecutaron con el chequeo de sesión activo y "Por cerrar" se comprobó en vivo en la web y en la app móvil</w:t>
+            </w:r>
+          </w:p>
+        </w:tc>
+        <w:tc>
+          <w:tcPr/>
+          <w:p>
+            <w:pPr>
+              <w:pStyle w:val="Compact"/>
+            </w:pPr>
+            <w:r>
+              <w:t xml:space="preserve">Agregar esos casos funcionales y ejecutarlos con el sistema completo; agregar una prueba de</w:t>
+            </w:r>
+            <w:r>
+              <w:t xml:space="preserve"> </w:t>
+            </w:r>
+            <w:r>
+              <w:rPr>
+                <w:rStyle w:val="VerbatimChar"/>
+              </w:rPr>
+              <w:t xml:space="preserve">PaymentAccountService</w:t>
+            </w:r>
+            <w:r>
+              <w:t xml:space="preserve"> </w:t>
+            </w:r>
+            <w:r>
+              <w:t xml:space="preserve">para la cuenta de efectivo</w:t>
             </w:r>
           </w:p>
         </w:tc>
@@ -15398,6 +15959,152 @@
           </w:p>
         </w:tc>
       </w:tr>
+      <w:tr>
+        <w:tc>
+          <w:tcPr/>
+          <w:p>
+            <w:pPr>
+              <w:pStyle w:val="Compact"/>
+            </w:pPr>
+            <w:r>
+              <w:t xml:space="preserve">11</w:t>
+            </w:r>
+          </w:p>
+        </w:tc>
+        <w:tc>
+          <w:tcPr/>
+          <w:p>
+            <w:pPr>
+              <w:pStyle w:val="Compact"/>
+            </w:pPr>
+            <w:r>
+              <w:t xml:space="preserve">La primera versión del cierre automático (21 de octubre) dejaba en No asistió toda reserva confirmada que nadie inició una hora después de su fin; si el operario lavó el carro y olvidó darle "Iniciar", el historial, los reportes y las métricas registraban que el cliente no vino, y No asistió es definitivo</w:t>
+            </w:r>
+          </w:p>
+        </w:tc>
+        <w:tc>
+          <w:tcPr/>
+          <w:p>
+            <w:pPr>
+              <w:pStyle w:val="Compact"/>
+            </w:pPr>
+            <w:r>
+              <w:t xml:space="preserve">Revisión del equipo del 21 de octubre de 2026;</w:t>
+            </w:r>
+            <w:r>
+              <w:t xml:space="preserve"> </w:t>
+            </w:r>
+            <w:r>
+              <w:rPr>
+                <w:rStyle w:val="VerbatimChar"/>
+              </w:rPr>
+              <w:t xml:space="preserve">ExpiredBookingsJob</w:t>
+            </w:r>
+            <w:r>
+              <w:t xml:space="preserve"> </w:t>
+            </w:r>
+            <w:r>
+              <w:t xml:space="preserve">y</w:t>
+            </w:r>
+            <w:r>
+              <w:t xml:space="preserve"> </w:t>
+            </w:r>
+            <w:r>
+              <w:rPr>
+                <w:rStyle w:val="VerbatimChar"/>
+              </w:rPr>
+              <w:t xml:space="preserve">Booking.expire</w:t>
+            </w:r>
+            <w:r>
+              <w:t xml:space="preserve"> </w:t>
+            </w:r>
+            <w:r>
+              <w:t xml:space="preserve">de booking-service</w:t>
+            </w:r>
+          </w:p>
+        </w:tc>
+        <w:tc>
+          <w:tcPr/>
+          <w:p>
+            <w:pPr>
+              <w:pStyle w:val="Compact"/>
+            </w:pPr>
+            <w:r>
+              <w:t xml:space="preserve">Alta</w:t>
+            </w:r>
+          </w:p>
+        </w:tc>
+      </w:tr>
+      <w:tr>
+        <w:tc>
+          <w:tcPr/>
+          <w:p>
+            <w:pPr>
+              <w:pStyle w:val="Compact"/>
+            </w:pPr>
+            <w:r>
+              <w:t xml:space="preserve">12</w:t>
+            </w:r>
+          </w:p>
+        </w:tc>
+        <w:tc>
+          <w:tcPr/>
+          <w:p>
+            <w:pPr>
+              <w:pStyle w:val="Compact"/>
+            </w:pPr>
+            <w:r>
+              <w:t xml:space="preserve">Un campo</w:t>
+            </w:r>
+            <w:r>
+              <w:t xml:space="preserve"> </w:t>
+            </w:r>
+            <w:r>
+              <w:rPr>
+                <w:rStyle w:val="VerbatimChar"/>
+              </w:rPr>
+              <w:t xml:space="preserve">null</w:t>
+            </w:r>
+            <w:r>
+              <w:t xml:space="preserve"> </w:t>
+            </w:r>
+            <w:r>
+              <w:t xml:space="preserve">en el payload de un evento mandaba el mensaje completo a la cola de errores (DLQ) de notification-service y el aviso no se creaba</w:t>
+            </w:r>
+          </w:p>
+        </w:tc>
+        <w:tc>
+          <w:tcPr/>
+          <w:p>
+            <w:pPr>
+              <w:pStyle w:val="Compact"/>
+            </w:pPr>
+            <w:r>
+              <w:rPr>
+                <w:rStyle w:val="VerbatimChar"/>
+              </w:rPr>
+              <w:t xml:space="preserve">DomainEventEnvelope.java</w:t>
+            </w:r>
+            <w:r>
+              <w:t xml:space="preserve"> </w:t>
+            </w:r>
+            <w:r>
+              <w:t xml:space="preserve">de notification-service</w:t>
+            </w:r>
+          </w:p>
+        </w:tc>
+        <w:tc>
+          <w:tcPr/>
+          <w:p>
+            <w:pPr>
+              <w:pStyle w:val="Compact"/>
+            </w:pPr>
+            <w:r>
+              <w:t xml:space="preserve">Media</w:t>
+            </w:r>
+          </w:p>
+        </w:tc>
+      </w:tr>
     </w:tbl>
     <w:p>
       <w:pPr>
@@ -15430,7 +16137,58 @@
         <w:t xml:space="preserve"> </w:t>
       </w:r>
       <w:r>
-        <w:t xml:space="preserve">de la web y de la app; el 8 y el 9 se volvieron a medir sin desbordes (Tabla 5c).</w:t>
+        <w:t xml:space="preserve">de la web y de la app; el 8 y el 9 se volvieron a medir sin desbordes (Tabla 5c). Los defectos 11 y 12 se corrigieron la noche del 21 de octubre de 2026: el sistema ya solo cancela la reserva programada que venció sin confirmarse y deja en No asistió la confirmada que nunca tuvo operario; la que tenía operario pasa a "Por cerrar" para que el administrador decida (11,</w:t>
+      </w:r>
+      <w:r>
+        <w:t xml:space="preserve"> </w:t>
+      </w:r>
+      <w:r>
+        <w:rPr>
+          <w:rStyle w:val="VerbatimChar"/>
+        </w:rPr>
+        <w:t xml:space="preserve">FollowUpPolicyTest</w:t>
+      </w:r>
+      <w:r>
+        <w:t xml:space="preserve">,</w:t>
+      </w:r>
+      <w:r>
+        <w:t xml:space="preserve"> </w:t>
+      </w:r>
+      <w:r>
+        <w:rPr>
+          <w:rStyle w:val="VerbatimChar"/>
+        </w:rPr>
+        <w:t xml:space="preserve">FollowUpServiceTest</w:t>
+      </w:r>
+      <w:r>
+        <w:t xml:space="preserve">); y el campo</w:t>
+      </w:r>
+      <w:r>
+        <w:t xml:space="preserve"> </w:t>
+      </w:r>
+      <w:r>
+        <w:rPr>
+          <w:rStyle w:val="VerbatimChar"/>
+        </w:rPr>
+        <w:t xml:space="preserve">null</w:t>
+      </w:r>
+      <w:r>
+        <w:t xml:space="preserve"> </w:t>
+      </w:r>
+      <w:r>
+        <w:t xml:space="preserve">se ignora (12,</w:t>
+      </w:r>
+      <w:r>
+        <w:t xml:space="preserve"> </w:t>
+      </w:r>
+      <w:r>
+        <w:rPr>
+          <w:rStyle w:val="VerbatimChar"/>
+        </w:rPr>
+        <w:t xml:space="preserve">DomainEventEnvelopeTest</w:t>
+      </w:r>
+      <w:r>
+        <w:t xml:space="preserve">).</w:t>
       </w:r>
     </w:p>
     <w:p>

</xml_diff>